<commit_message>
Update thesis and export script
</commit_message>
<xml_diff>
--- a/docs/deliverables/Djordje_Velickovic_Master_Thesis.docx
+++ b/docs/deliverables/Djordje_Velickovic_Master_Thesis.docx
@@ -2,191 +2,609 @@
 <file path=word/document.xml><?xml version="1.0" encoding="utf-8"?>
 <w:document xmlns:w="http://schemas.openxmlformats.org/wordprocessingml/2006/main" xmlns:m="http://schemas.openxmlformats.org/officeDocument/2006/math" xmlns:r="http://schemas.openxmlformats.org/officeDocument/2006/relationships" xmlns:o="urn:schemas-microsoft-com:office:office" xmlns:v="urn:schemas-microsoft-com:vml" xmlns:w10="urn:schemas-microsoft-com:office:word" xmlns:a="http://schemas.openxmlformats.org/drawingml/2006/main" xmlns:pic="http://schemas.openxmlformats.org/drawingml/2006/picture" xmlns:wp="http://schemas.openxmlformats.org/drawingml/2006/wordprocessingDrawing">
   <w:body>
-    <w:p>
-      <w:pPr>
-        <w:pStyle w:val="FirstParagraph"/>
-        <w:keepNext/>
-        <w:spacing w:line="240" w:lineRule="auto" w:before="0" w:after="0"/>
-        <w:jc w:val="center"/>
-      </w:pPr>
-      <w:r>
-        <w:drawing>
-          <wp:inline>
-            <wp:extent cx="863999" cy="584181"/>
-            <wp:effectExtent b="0" l="0" r="0" t="0"/>
-            <wp:docPr descr="" title="" id="69" name="Picture"/>
-            <a:graphic>
-              <a:graphicData uri="http://schemas.openxmlformats.org/drawingml/2006/picture">
-                <pic:pic>
-                  <pic:nvPicPr>
-                    <pic:cNvPr descr="/private/tmp/wcl-thesis-refs.5Cpxri/thesis_unzip/word/media/image1.jpg" id="70" name="Picture"/>
-                    <pic:cNvPicPr>
-                      <a:picLocks noChangeArrowheads="1" noChangeAspect="1"/>
-                    </pic:cNvPicPr>
-                  </pic:nvPicPr>
-                  <pic:blipFill>
-                    <a:blip r:embed="rId68"/>
-                    <a:stretch>
-                      <a:fillRect/>
-                    </a:stretch>
-                  </pic:blipFill>
-                  <pic:spPr bwMode="auto">
-                    <a:xfrm>
-                      <a:off x="0" y="0"/>
-                      <a:ext cx="863999" cy="584181"/>
-                    </a:xfrm>
-                    <a:prstGeom prst="rect">
-                      <a:avLst/>
-                    </a:prstGeom>
-                    <a:noFill/>
-                    <a:ln w="9525">
-                      <a:noFill/>
-                      <a:headEnd/>
-                      <a:tailEnd/>
-                    </a:ln>
-                  </pic:spPr>
-                </pic:pic>
-              </a:graphicData>
-            </a:graphic>
-          </wp:inline>
-        </w:drawing>
-      </w:r>
-    </w:p>
-    <w:p>
-      <w:pPr>
-        <w:pStyle w:val="BodyText"/>
-        <w:spacing w:before="120" w:after="0" w:line="240" w:lineRule="auto"/>
-        <w:jc w:val="center"/>
-      </w:pPr>
-      <w:r>
-        <w:rPr>
-          <w:rFonts w:ascii="Times New Roman" w:hAnsi="Times New Roman" w:eastAsia="Times New Roman"/>
-          <w:b/>
-          <w:sz w:val="28"/>
-        </w:rPr>
-        <w:t>UNION UNIVERSITY</w:t>
-      </w:r>
-    </w:p>
-    <w:p>
-      <w:pPr>
-        <w:pStyle w:val="BodyText"/>
-        <w:spacing w:before="0" w:after="200" w:line="240" w:lineRule="auto"/>
-        <w:jc w:val="center"/>
-      </w:pPr>
-      <w:r>
-        <w:rPr>
-          <w:rFonts w:ascii="Times New Roman" w:hAnsi="Times New Roman" w:eastAsia="Times New Roman"/>
-          <w:b/>
-          <w:sz w:val="28"/>
-        </w:rPr>
-        <w:t>SCHOOL OF COMPUTING BELGRADE, SERBIA</w:t>
-      </w:r>
-    </w:p>
-    <w:p>
-      <w:pPr>
-        <w:pStyle w:val="BodyText"/>
-        <w:spacing w:before="80" w:after="480" w:line="240" w:lineRule="auto"/>
-        <w:jc w:val="center"/>
-      </w:pPr>
-      <w:r>
-        <w:rPr>
-          <w:rFonts w:ascii="Times New Roman" w:hAnsi="Times New Roman" w:eastAsia="Times New Roman"/>
-          <w:b/>
-          <w:sz w:val="26"/>
-        </w:rPr>
-        <w:t>MASTER IN COMPUTATIONAL FINANCE</w:t>
-      </w:r>
-    </w:p>
-    <w:p>
-      <w:pPr>
-        <w:pStyle w:val="BodyText"/>
-        <w:spacing w:before="320" w:after="320" w:line="240" w:lineRule="auto"/>
-        <w:jc w:val="center"/>
-      </w:pPr>
-      <w:r>
-        <w:rPr>
-          <w:rFonts w:ascii="Times New Roman" w:hAnsi="Times New Roman" w:eastAsia="Times New Roman"/>
-          <w:b/>
-          <w:sz w:val="32"/>
-        </w:rPr>
-        <w:t>MASTER’S THESIS</w:t>
-      </w:r>
-    </w:p>
-    <w:p>
-      <w:pPr>
-        <w:pStyle w:val="BodyText"/>
-        <w:spacing w:before="120" w:after="560" w:line="240" w:lineRule="auto"/>
-        <w:jc w:val="center"/>
-      </w:pPr>
-      <w:r>
-        <w:rPr>
-          <w:rFonts w:ascii="Times New Roman" w:hAnsi="Times New Roman" w:eastAsia="Times New Roman"/>
-          <w:b/>
-          <w:sz w:val="32"/>
-        </w:rPr>
-        <w:t>Dynamic Determination of Short-Term Corporate Credit Limits Using Machine Learning</w:t>
-      </w:r>
-    </w:p>
-    <w:p>
-      <w:pPr>
-        <w:pStyle w:val="BodyText"/>
-        <w:spacing w:before="120" w:after="0" w:line="240" w:lineRule="auto"/>
-        <w:jc w:val="center"/>
-      </w:pPr>
-      <w:r>
-        <w:rPr>
-          <w:rFonts w:ascii="Times New Roman" w:hAnsi="Times New Roman" w:eastAsia="Times New Roman"/>
-          <w:b w:val="0"/>
-          <w:sz w:val="24"/>
-        </w:rPr>
-        <w:t>Student: Đorđe Veličković</w:t>
-      </w:r>
-    </w:p>
-    <w:p>
-      <w:pPr>
-        <w:pStyle w:val="BodyText"/>
-        <w:spacing w:before="0" w:after="0" w:line="240" w:lineRule="auto"/>
-        <w:jc w:val="center"/>
-      </w:pPr>
-      <w:r>
-        <w:rPr>
-          <w:rFonts w:ascii="Times New Roman" w:hAnsi="Times New Roman" w:eastAsia="Times New Roman"/>
-          <w:b w:val="0"/>
-          <w:sz w:val="24"/>
-        </w:rPr>
-        <w:t>Student ID number: [TO BE ENTERED]</w:t>
-      </w:r>
-    </w:p>
-    <w:p>
-      <w:pPr>
-        <w:pStyle w:val="BodyText"/>
-        <w:spacing w:before="0" w:after="600" w:line="240" w:lineRule="auto"/>
-        <w:jc w:val="center"/>
-      </w:pPr>
-      <w:r>
-        <w:rPr>
-          <w:rFonts w:ascii="Times New Roman" w:hAnsi="Times New Roman" w:eastAsia="Times New Roman"/>
-          <w:b w:val="0"/>
-          <w:sz w:val="24"/>
-        </w:rPr>
-        <w:t>Supervisor: Prof. Dr. Branko Urošević</w:t>
-      </w:r>
-    </w:p>
-    <w:p>
-      <w:pPr>
-        <w:pStyle w:val="BodyText"/>
-        <w:spacing w:before="0" w:after="0" w:line="240" w:lineRule="auto"/>
-        <w:jc w:val="center"/>
-      </w:pPr>
-      <w:r>
-        <w:rPr>
-          <w:rFonts w:ascii="Times New Roman" w:hAnsi="Times New Roman" w:eastAsia="Times New Roman"/>
-          <w:b w:val="0"/>
-          <w:sz w:val="24"/>
-        </w:rPr>
-        <w:t>Belgrade, October 2026</w:t>
-      </w:r>
-    </w:p>
+    <w:tbl xmlns:w14="http://schemas.microsoft.com/office/word/2010/wordml" xmlns:wp14="http://schemas.microsoft.com/office/word/2010/wordprocessingDrawing">
+      <w:tblPr>
+        <w:tblStyle w:val="TableGrid"/>
+        <w:tblW w:w="9359" w:type="dxa"/>
+        <w:tblInd w:w="130" w:type="dxa"/>
+        <w:tblCellMar>
+          <w:top w:w="52" w:type="dxa"/>
+          <w:left w:w="117" w:type="dxa"/>
+          <w:bottom w:w="44" w:type="dxa"/>
+          <w:right w:w="80" w:type="dxa"/>
+        </w:tblCellMar>
+        <w:tblLook w:val="04A0" w:firstRow="1" w:lastRow="0" w:firstColumn="1" w:lastColumn="0" w:noHBand="0" w:noVBand="1"/>
+      </w:tblPr>
+      <w:tblGrid>
+        <w:gridCol w:w="1697"/>
+        <w:gridCol w:w="5955"/>
+        <w:gridCol w:w="1707"/>
+      </w:tblGrid>
+      <w:tr>
+        <w:trPr>
+          <w:trHeight w:val="377"/>
+        </w:trPr>
+        <w:tc>
+          <w:tcPr>
+            <w:tcW w:w="1697" w:type="dxa"/>
+            <w:vMerge w:val="restart"/>
+            <w:tcBorders>
+              <w:top w:val="single" w:sz="12" w:space="0" w:color="000000"/>
+              <w:left w:val="single" w:sz="12" w:space="0" w:color="000000"/>
+              <w:bottom w:val="single" w:sz="14" w:space="0" w:color="000000"/>
+              <w:right w:val="single" w:sz="12" w:space="0" w:color="000000"/>
+            </w:tcBorders>
+            <w:vAlign w:val="bottom"/>
+          </w:tcPr>
+          <w:p>
+            <w:pPr>
+              <w:pStyle w:val="NoSpacing"/>
+              <w:ind w:left="0" w:firstLine="0"/>
+            </w:pPr>
+            <w:r>
+              <w:rPr>
+                <w:noProof/>
+              </w:rPr>
+              <w:drawing>
+                <wp:anchor distT="0" distB="0" distL="114300" distR="114300" simplePos="0" relativeHeight="251658240" behindDoc="0" locked="0" layoutInCell="1" allowOverlap="1" wp14:anchorId="61FF548D" wp14:editId="09E2A606">
+                  <wp:simplePos x="1066800" y="1409700"/>
+                  <wp:positionH relativeFrom="margin">
+                    <wp:posOffset>17780</wp:posOffset>
+                  </wp:positionH>
+                  <wp:positionV relativeFrom="margin">
+                    <wp:posOffset>-132080</wp:posOffset>
+                  </wp:positionV>
+                  <wp:extent cx="885190" cy="609600"/>
+                  <wp:effectExtent l="0" t="0" r="0" b="0"/>
+                  <wp:wrapSquare wrapText="bothSides"/>
+                  <wp:docPr id="160" name="Picture 160"/>
+                  <wp:cNvGraphicFramePr/>
+                  <a:graphic>
+                    <a:graphicData uri="http://schemas.openxmlformats.org/drawingml/2006/picture">
+                      <pic:pic>
+                        <pic:nvPicPr>
+                          <pic:cNvPr id="160" name="Picture 160"/>
+                          <pic:cNvPicPr/>
+                        </pic:nvPicPr>
+                        <pic:blipFill>
+                          <a:blip r:embed="rId8">
+                            <a:extLst>
+                              <a:ext uri="{28A0092B-C50C-407E-A947-70E740481C1C}">
+                                <a14:useLocalDpi xmlns:a14="http://schemas.microsoft.com/office/drawing/2010/main" val="0"/>
+                              </a:ext>
+                            </a:extLst>
+                          </a:blip>
+                          <a:stretch>
+                            <a:fillRect/>
+                          </a:stretch>
+                        </pic:blipFill>
+                        <pic:spPr>
+                          <a:xfrm>
+                            <a:off x="0" y="0"/>
+                            <a:ext cx="885190" cy="609600"/>
+                          </a:xfrm>
+                          <a:prstGeom prst="rect">
+                            <a:avLst/>
+                          </a:prstGeom>
+                        </pic:spPr>
+                      </pic:pic>
+                    </a:graphicData>
+                  </a:graphic>
+                  <wp14:sizeRelH relativeFrom="margin">
+                    <wp14:pctWidth>0</wp14:pctWidth>
+                  </wp14:sizeRelH>
+                  <wp14:sizeRelV relativeFrom="margin">
+                    <wp14:pctHeight>0</wp14:pctHeight>
+                  </wp14:sizeRelV>
+                </wp:anchor>
+              </w:drawing>
+            </w:r>
+          </w:p>
+        </w:tc>
+        <w:tc>
+          <w:tcPr>
+            <w:tcW w:w="5955" w:type="dxa"/>
+            <w:vMerge w:val="restart"/>
+            <w:tcBorders>
+              <w:top w:val="single" w:sz="12" w:space="0" w:color="000000"/>
+              <w:left w:val="single" w:sz="12" w:space="0" w:color="000000"/>
+              <w:bottom w:val="single" w:sz="14" w:space="0" w:color="000000"/>
+              <w:right w:val="single" w:sz="12" w:space="0" w:color="000000"/>
+            </w:tcBorders>
+            <w:vAlign w:val="center"/>
+          </w:tcPr>
+          <w:p>
+            <w:pPr>
+              <w:spacing w:line="259" w:lineRule="auto"/>
+            </w:pPr>
+            <w:r>
+              <w:t xml:space="preserve">UNION UNIVERSITY </w:t>
+            </w:r>
+          </w:p>
+          <w:p>
+            <w:pPr>
+              <w:spacing w:after="38" w:line="259" w:lineRule="auto"/>
+            </w:pPr>
+            <w:r>
+              <w:rPr>
+                <w:b/>
+              </w:rPr>
+              <w:t>SCHOOL OF COMPUTING</w:t>
+            </w:r>
+            <w:r>
+              <w:t xml:space="preserve">  </w:t>
+            </w:r>
+          </w:p>
+          <w:p>
+            <w:pPr>
+              <w:spacing w:line="259" w:lineRule="auto"/>
+            </w:pPr>
+            <w:r>
+              <w:t xml:space="preserve">Knez Mihailova 6/VI  </w:t>
+            </w:r>
+          </w:p>
+          <w:p>
+            <w:pPr>
+              <w:spacing w:line="259" w:lineRule="auto"/>
+            </w:pPr>
+            <w:r>
+              <w:t>11000 BELGRADE, SERBIA</w:t>
+            </w:r>
+            <w:r>
+              <w:rPr>
+                <w:sz w:val="20"/>
+              </w:rPr>
+              <w:t xml:space="preserve"> </w:t>
+            </w:r>
+          </w:p>
+        </w:tc>
+        <w:tc>
+          <w:tcPr>
+            <w:tcW w:w="1707" w:type="dxa"/>
+            <w:tcBorders>
+              <w:top w:val="single" w:sz="12" w:space="0" w:color="000000"/>
+              <w:left w:val="single" w:sz="12" w:space="0" w:color="000000"/>
+              <w:bottom w:val="single" w:sz="12" w:space="0" w:color="auto"/>
+              <w:right w:val="single" w:sz="12" w:space="0" w:color="000000"/>
+            </w:tcBorders>
+          </w:tcPr>
+          <w:p>
+            <w:pPr>
+              <w:spacing w:line="259" w:lineRule="auto"/>
+              <w:ind w:left="24"/>
+            </w:pPr>
+            <w:r>
+              <w:rPr>
+                <w:sz w:val="20"/>
+              </w:rPr>
+              <w:t xml:space="preserve">Number:  </w:t>
+            </w:r>
+          </w:p>
+        </w:tc>
+      </w:tr>
+      <w:tr>
+        <w:trPr>
+          <w:trHeight w:val="346"/>
+        </w:trPr>
+        <w:tc>
+          <w:tcPr>
+            <w:tcW w:w="0" w:type="auto"/>
+            <w:vMerge/>
+            <w:tcBorders>
+              <w:top w:val="nil"/>
+              <w:left w:val="single" w:sz="12" w:space="0" w:color="000000"/>
+              <w:bottom w:val="nil"/>
+              <w:right w:val="single" w:sz="12" w:space="0" w:color="000000"/>
+            </w:tcBorders>
+          </w:tcPr>
+          <w:p>
+            <w:pPr>
+              <w:spacing w:after="160" w:line="259" w:lineRule="auto"/>
+            </w:pPr>
+          </w:p>
+        </w:tc>
+        <w:tc>
+          <w:tcPr>
+            <w:tcW w:w="0" w:type="auto"/>
+            <w:vMerge/>
+            <w:tcBorders>
+              <w:top w:val="nil"/>
+              <w:left w:val="single" w:sz="12" w:space="0" w:color="000000"/>
+              <w:bottom w:val="nil"/>
+              <w:right w:val="single" w:sz="12" w:space="0" w:color="000000"/>
+            </w:tcBorders>
+          </w:tcPr>
+          <w:p>
+            <w:pPr>
+              <w:spacing w:after="160" w:line="259" w:lineRule="auto"/>
+            </w:pPr>
+          </w:p>
+        </w:tc>
+        <w:tc>
+          <w:tcPr>
+            <w:tcW w:w="1707" w:type="dxa"/>
+            <w:tcBorders>
+              <w:top w:val="single" w:sz="12" w:space="0" w:color="auto"/>
+              <w:left w:val="single" w:sz="12" w:space="0" w:color="000000"/>
+              <w:bottom w:val="single" w:sz="12" w:space="0" w:color="000000"/>
+              <w:right w:val="single" w:sz="12" w:space="0" w:color="000000"/>
+            </w:tcBorders>
+          </w:tcPr>
+          <w:p>
+            <w:pPr>
+              <w:spacing w:line="259" w:lineRule="auto"/>
+              <w:ind w:left="24"/>
+            </w:pPr>
+            <w:r>
+              <w:rPr>
+                <w:sz w:val="20"/>
+              </w:rPr>
+              <w:t xml:space="preserve">  </w:t>
+            </w:r>
+          </w:p>
+        </w:tc>
+      </w:tr>
+      <w:tr>
+        <w:trPr>
+          <w:trHeight w:val="384"/>
+        </w:trPr>
+        <w:tc>
+          <w:tcPr>
+            <w:tcW w:w="0" w:type="auto"/>
+            <w:vMerge/>
+            <w:tcBorders>
+              <w:top w:val="nil"/>
+              <w:left w:val="single" w:sz="12" w:space="0" w:color="000000"/>
+              <w:bottom w:val="nil"/>
+              <w:right w:val="single" w:sz="12" w:space="0" w:color="000000"/>
+            </w:tcBorders>
+          </w:tcPr>
+          <w:p>
+            <w:pPr>
+              <w:spacing w:after="160" w:line="259" w:lineRule="auto"/>
+            </w:pPr>
+          </w:p>
+        </w:tc>
+        <w:tc>
+          <w:tcPr>
+            <w:tcW w:w="0" w:type="auto"/>
+            <w:vMerge/>
+            <w:tcBorders>
+              <w:top w:val="nil"/>
+              <w:left w:val="single" w:sz="12" w:space="0" w:color="000000"/>
+              <w:bottom w:val="nil"/>
+              <w:right w:val="single" w:sz="12" w:space="0" w:color="000000"/>
+            </w:tcBorders>
+          </w:tcPr>
+          <w:p>
+            <w:pPr>
+              <w:spacing w:after="160" w:line="259" w:lineRule="auto"/>
+            </w:pPr>
+          </w:p>
+        </w:tc>
+        <w:tc>
+          <w:tcPr>
+            <w:tcW w:w="1707" w:type="dxa"/>
+            <w:tcBorders>
+              <w:top w:val="single" w:sz="12" w:space="0" w:color="000000"/>
+              <w:left w:val="single" w:sz="12" w:space="0" w:color="000000"/>
+              <w:bottom w:val="single" w:sz="8" w:space="0" w:color="000000"/>
+              <w:right w:val="single" w:sz="12" w:space="0" w:color="000000"/>
+            </w:tcBorders>
+          </w:tcPr>
+          <w:p>
+            <w:pPr>
+              <w:spacing w:line="259" w:lineRule="auto"/>
+              <w:ind w:left="24"/>
+            </w:pPr>
+            <w:r>
+              <w:rPr>
+                <w:sz w:val="20"/>
+              </w:rPr>
+              <w:t xml:space="preserve">Date:  </w:t>
+            </w:r>
+          </w:p>
+        </w:tc>
+      </w:tr>
+      <w:tr>
+        <w:trPr>
+          <w:trHeight w:val="299"/>
+        </w:trPr>
+        <w:tc>
+          <w:tcPr>
+            <w:tcW w:w="0" w:type="auto"/>
+            <w:vMerge/>
+            <w:tcBorders>
+              <w:top w:val="nil"/>
+              <w:left w:val="single" w:sz="12" w:space="0" w:color="000000"/>
+              <w:bottom w:val="single" w:sz="12" w:space="0" w:color="auto"/>
+              <w:right w:val="single" w:sz="12" w:space="0" w:color="000000"/>
+            </w:tcBorders>
+          </w:tcPr>
+          <w:p>
+            <w:pPr>
+              <w:spacing w:after="160" w:line="259" w:lineRule="auto"/>
+            </w:pPr>
+          </w:p>
+        </w:tc>
+        <w:tc>
+          <w:tcPr>
+            <w:tcW w:w="0" w:type="auto"/>
+            <w:vMerge/>
+            <w:tcBorders>
+              <w:top w:val="nil"/>
+              <w:left w:val="single" w:sz="12" w:space="0" w:color="000000"/>
+              <w:bottom w:val="single" w:sz="12" w:space="0" w:color="auto"/>
+              <w:right w:val="single" w:sz="12" w:space="0" w:color="000000"/>
+            </w:tcBorders>
+          </w:tcPr>
+          <w:p>
+            <w:pPr>
+              <w:spacing w:after="160" w:line="259" w:lineRule="auto"/>
+            </w:pPr>
+          </w:p>
+        </w:tc>
+        <w:tc>
+          <w:tcPr>
+            <w:tcW w:w="1707" w:type="dxa"/>
+            <w:tcBorders>
+              <w:top w:val="single" w:sz="8" w:space="0" w:color="000000"/>
+              <w:left w:val="single" w:sz="12" w:space="0" w:color="000000"/>
+              <w:bottom w:val="single" w:sz="12" w:space="0" w:color="auto"/>
+              <w:right w:val="single" w:sz="12" w:space="0" w:color="000000"/>
+            </w:tcBorders>
+          </w:tcPr>
+          <w:p>
+            <w:pPr>
+              <w:spacing w:line="259" w:lineRule="auto"/>
+              <w:ind w:left="24"/>
+            </w:pPr>
+            <w:r>
+              <w:rPr>
+                <w:sz w:val="20"/>
+              </w:rPr>
+              <w:t xml:space="preserve"> </w:t>
+            </w:r>
+          </w:p>
+        </w:tc>
+      </w:tr>
+      <w:tr>
+        <w:trPr>
+          <w:trHeight w:val="11000" w:hRule="atLeast"/>
+          <w:cantSplit/>
+        </w:trPr>
+        <w:tc>
+          <w:tcPr>
+            <w:tcW w:w="9359" w:type="dxa"/>
+            <w:gridSpan w:val="3"/>
+            <w:tcBorders>
+              <w:top w:val="nil"/>
+              <w:left w:val="single" w:sz="12" w:space="0" w:color="000000"/>
+              <w:bottom w:val="single" w:sz="12" w:space="0" w:color="auto"/>
+              <w:right w:val="single" w:sz="12" w:space="0" w:color="000000"/>
+            </w:tcBorders>
+          </w:tcPr>
+          <w:p>
+            <w:pPr>
+              <w:spacing w:line="240" w:lineRule="auto" w:before="0" w:after="200"/>
+              <w:ind w:left="187"/>
+              <w:jc w:val="left"/>
+              <w:rPr>
+                <w:b/>
+                <w:sz w:val="28"/>
+              </w:rPr>
+            </w:pPr>
+            <w:r>
+              <w:rPr>
+                <w:rFonts w:ascii="Times New Roman" w:hAnsi="Times New Roman" w:eastAsia="Times New Roman"/>
+                <w:b/>
+                <w:sz w:val="28"/>
+                <w:u w:val="none"/>
+              </w:rPr>
+              <w:t>UNION UNIVERSITY</w:t>
+            </w:r>
+          </w:p>
+          <w:p>
+            <w:pPr>
+              <w:spacing w:line="240" w:lineRule="auto" w:before="0" w:after="200"/>
+              <w:ind w:left="187"/>
+              <w:jc w:val="left"/>
+            </w:pPr>
+            <w:r>
+              <w:rPr>
+                <w:rFonts w:ascii="Times New Roman" w:hAnsi="Times New Roman" w:eastAsia="Times New Roman"/>
+                <w:b/>
+                <w:sz w:val="28"/>
+                <w:u w:val="none"/>
+              </w:rPr>
+              <w:t>SCHOOL OF COMPUTING BELGRADE, SERBIA</w:t>
+            </w:r>
+          </w:p>
+          <w:p>
+            <w:pPr>
+              <w:spacing w:line="240" w:lineRule="auto" w:before="0" w:after="840"/>
+              <w:ind w:left="187"/>
+              <w:jc w:val="left"/>
+            </w:pPr>
+            <w:r>
+              <w:rPr>
+                <w:rFonts w:ascii="Times New Roman" w:hAnsi="Times New Roman" w:eastAsia="Times New Roman"/>
+                <w:b/>
+                <w:sz w:val="28"/>
+                <w:u w:val="none"/>
+              </w:rPr>
+              <w:t>MASTER IN COMPUTATIONAL FINANCE</w:t>
+            </w:r>
+          </w:p>
+          <w:p>
+            <w:pPr>
+              <w:spacing w:line="240" w:lineRule="auto" w:before="0" w:after="960"/>
+              <w:jc w:val="center"/>
+            </w:pPr>
+            <w:r>
+              <w:rPr>
+                <w:rFonts w:ascii="Times New Roman" w:hAnsi="Times New Roman" w:eastAsia="Times New Roman"/>
+                <w:b/>
+                <w:sz w:val="44"/>
+                <w:u w:val="none"/>
+              </w:rPr>
+              <w:t>MASTER'S THESIS</w:t>
+            </w:r>
+          </w:p>
+          <w:p>
+            <w:pPr>
+              <w:spacing w:line="240" w:lineRule="auto" w:before="0" w:after="60"/>
+              <w:ind w:left="187"/>
+              <w:jc w:val="left"/>
+            </w:pPr>
+            <w:r>
+              <w:rPr>
+                <w:rFonts w:ascii="Times New Roman" w:hAnsi="Times New Roman" w:eastAsia="Times New Roman"/>
+                <w:b/>
+                <w:sz w:val="28"/>
+                <w:u w:val="single"/>
+              </w:rPr>
+              <w:t>Student:</w:t>
+            </w:r>
+            <w:r>
+              <w:rPr>
+                <w:rFonts w:ascii="Times New Roman" w:hAnsi="Times New Roman" w:eastAsia="Times New Roman"/>
+                <w:b/>
+                <w:sz w:val="28"/>
+                <w:u w:val="none"/>
+              </w:rPr>
+              <w:t xml:space="preserve"> Đorđe Veličković</w:t>
+            </w:r>
+          </w:p>
+          <w:p>
+            <w:pPr>
+              <w:spacing w:line="240" w:lineRule="auto" w:before="0" w:after="680"/>
+              <w:ind w:left="187"/>
+              <w:jc w:val="left"/>
+            </w:pPr>
+            <w:r>
+              <w:rPr>
+                <w:rFonts w:ascii="Times New Roman" w:hAnsi="Times New Roman" w:eastAsia="Times New Roman"/>
+                <w:b/>
+                <w:sz w:val="28"/>
+                <w:u w:val="single"/>
+              </w:rPr>
+              <w:t>Student ID number:</w:t>
+            </w:r>
+            <w:r>
+              <w:rPr>
+                <w:rFonts w:ascii="Times New Roman" w:hAnsi="Times New Roman" w:eastAsia="Times New Roman"/>
+                <w:b/>
+                <w:sz w:val="28"/>
+                <w:u w:val="none"/>
+              </w:rPr>
+              <w:t xml:space="preserve"> [TO BE ENTERED]</w:t>
+            </w:r>
+          </w:p>
+          <w:p>
+            <w:pPr>
+              <w:spacing w:line="240" w:lineRule="auto" w:before="0" w:after="200"/>
+              <w:ind w:left="187"/>
+              <w:jc w:val="left"/>
+            </w:pPr>
+            <w:r>
+              <w:rPr>
+                <w:rFonts w:ascii="Times New Roman" w:hAnsi="Times New Roman" w:eastAsia="Times New Roman"/>
+                <w:b/>
+                <w:sz w:val="28"/>
+                <w:u w:val="single"/>
+              </w:rPr>
+              <w:t>Title:</w:t>
+            </w:r>
+          </w:p>
+          <w:p>
+            <w:pPr>
+              <w:spacing w:line="240" w:lineRule="auto" w:before="0" w:after="0"/>
+              <w:jc w:val="center"/>
+            </w:pPr>
+            <w:r>
+              <w:rPr>
+                <w:rFonts w:ascii="Times New Roman" w:hAnsi="Times New Roman" w:eastAsia="Times New Roman"/>
+                <w:b/>
+                <w:sz w:val="32"/>
+                <w:u w:val="none"/>
+              </w:rPr>
+              <w:t>Dynamic Determination of Short-Term</w:t>
+            </w:r>
+          </w:p>
+          <w:p>
+            <w:pPr>
+              <w:spacing w:line="240" w:lineRule="auto" w:before="0" w:after="0"/>
+              <w:jc w:val="center"/>
+            </w:pPr>
+            <w:r>
+              <w:rPr>
+                <w:rFonts w:ascii="Times New Roman" w:hAnsi="Times New Roman" w:eastAsia="Times New Roman"/>
+                <w:b/>
+                <w:sz w:val="32"/>
+                <w:u w:val="none"/>
+              </w:rPr>
+              <w:t>Corporate Credit Limits Using</w:t>
+            </w:r>
+          </w:p>
+          <w:p>
+            <w:pPr>
+              <w:spacing w:line="240" w:lineRule="auto" w:before="0" w:after="680"/>
+              <w:jc w:val="center"/>
+            </w:pPr>
+            <w:r>
+              <w:rPr>
+                <w:rFonts w:ascii="Times New Roman" w:hAnsi="Times New Roman" w:eastAsia="Times New Roman"/>
+                <w:b/>
+                <w:sz w:val="32"/>
+                <w:u w:val="none"/>
+              </w:rPr>
+              <w:t>Machine Learning</w:t>
+            </w:r>
+          </w:p>
+          <w:p>
+            <w:pPr>
+              <w:spacing w:line="240" w:lineRule="auto" w:before="0" w:after="1240"/>
+              <w:ind w:left="187"/>
+              <w:jc w:val="left"/>
+            </w:pPr>
+            <w:r>
+              <w:rPr>
+                <w:rFonts w:ascii="Times New Roman" w:hAnsi="Times New Roman" w:eastAsia="Times New Roman"/>
+                <w:b/>
+                <w:sz w:val="28"/>
+                <w:u w:val="single"/>
+              </w:rPr>
+              <w:t>Supervisor:</w:t>
+            </w:r>
+            <w:r>
+              <w:rPr>
+                <w:rFonts w:ascii="Times New Roman" w:hAnsi="Times New Roman" w:eastAsia="Times New Roman"/>
+                <w:b/>
+                <w:sz w:val="28"/>
+                <w:u w:val="none"/>
+              </w:rPr>
+              <w:t xml:space="preserve"> Prof. Dr. Branko Urošević</w:t>
+            </w:r>
+          </w:p>
+          <w:p>
+            <w:pPr>
+              <w:spacing w:line="240" w:lineRule="auto" w:before="0" w:after="0"/>
+              <w:jc w:val="center"/>
+            </w:pPr>
+            <w:r>
+              <w:rPr>
+                <w:rFonts w:ascii="Times New Roman" w:hAnsi="Times New Roman" w:eastAsia="Times New Roman"/>
+                <w:b/>
+                <w:sz w:val="28"/>
+                <w:u w:val="none"/>
+              </w:rPr>
+              <w:t>Belgrade, October 2026</w:t>
+            </w:r>
+          </w:p>
+        </w:tc>
+      </w:tr>
+    </w:tbl>
     <w:p>
       <w:pPr>
         <w:pStyle w:val="Heading1"/>
@@ -206,7 +624,7 @@
     </w:p>
     <w:p>
       <w:pPr>
-        <w:pStyle w:val="FirstParagraph"/>
+        <w:pStyle w:val="BodyText"/>
         <w:spacing w:before="0" w:after="200" w:line="276" w:lineRule="auto"/>
         <w:jc w:val="both"/>
       </w:pPr>
@@ -315,7 +733,7 @@
     </w:p>
     <w:p>
       <w:pPr>
-        <w:pStyle w:val="FirstParagraph"/>
+        <w:pStyle w:val="BodyText"/>
         <w:tabs>
           <w:tab w:pos="8787" w:val="right" w:leader="dot"/>
         </w:tabs>
@@ -1962,7 +2380,7 @@
           <w:rFonts w:ascii="Times New Roman" w:hAnsi="Times New Roman" w:eastAsia="Times New Roman"/>
           <w:sz w:val="24"/>
         </w:rPr>
-        <w:t>36</w:t>
+        <w:t>35</w:t>
       </w:r>
     </w:p>
     <w:p>
@@ -2656,7 +3074,7 @@
     </w:p>
     <w:p>
       <w:pPr>
-        <w:pStyle w:val="FirstParagraph"/>
+        <w:pStyle w:val="BodyText"/>
         <w:tabs>
           <w:tab w:pos="8787" w:val="right" w:leader="dot"/>
         </w:tabs>
@@ -2669,7 +3087,7 @@
           <w:rFonts w:ascii="Times New Roman" w:hAnsi="Times New Roman" w:eastAsia="Times New Roman"/>
           <w:sz w:val="24"/>
         </w:rPr>
-        <w:t>Figure 1. Labeled panel before chronological purging. Positive rows are monthly prediction outcomes, not separate episodes. Source: primary model experiment panel audit and descriptive report.</w:t>
+        <w:t>Figure 1. Sample coverage and positive-label share.</w:t>
       </w:r>
       <w:r>
         <w:tab/>
@@ -2697,7 +3115,7 @@
           <w:rFonts w:ascii="Times New Roman" w:hAnsi="Times New Roman" w:eastAsia="Times New Roman"/>
           <w:sz w:val="24"/>
         </w:rPr>
-        <w:t>Figure 2. Ranking and probability diagnostics for 2023–2025. Source: primary model experiment predictions and model report.</w:t>
+        <w:t>Figure 2. Model diagnostics, 2023–2025.</w:t>
       </w:r>
       <w:r>
         <w:tab/>
@@ -2725,7 +3143,7 @@
           <w:rFonts w:ascii="Times New Roman" w:hAnsi="Times New Roman" w:eastAsia="Times New Roman"/>
           <w:sz w:val="24"/>
         </w:rPr>
-        <w:t>Figure 3. Average assigned limit as a percentage of reported assets under the reference policy and selected alternative assumptions. Each scenario uses the same historical financial observations. Source: primary model experiment policy replay.</w:t>
+        <w:t>Figure 3. Policy sensitivity.</w:t>
       </w:r>
       <w:r>
         <w:tab/>
@@ -2757,7 +3175,7 @@
     </w:p>
     <w:p>
       <w:pPr>
-        <w:pStyle w:val="FirstParagraph"/>
+        <w:pStyle w:val="BodyText"/>
         <w:tabs>
           <w:tab w:pos="8787" w:val="right" w:leader="dot"/>
         </w:tabs>
@@ -3004,7 +3422,7 @@
           <w:rFonts w:ascii="Times New Roman" w:hAnsi="Times New Roman" w:eastAsia="Times New Roman"/>
           <w:sz w:val="24"/>
         </w:rPr>
-        <w:t>30</w:t>
+        <w:t>29</w:t>
       </w:r>
     </w:p>
     <w:p>
@@ -3544,7 +3962,7 @@
     </w:p>
     <w:p>
       <w:pPr>
-        <w:pStyle w:val="FirstParagraph"/>
+        <w:pStyle w:val="BodyText"/>
         <w:spacing w:before="0" w:after="200" w:line="276" w:lineRule="auto"/>
         <w:jc w:val="both"/>
       </w:pPr>
@@ -3691,7 +4109,7 @@
     </w:p>
     <w:p>
       <w:pPr>
-        <w:pStyle w:val="FirstParagraph"/>
+        <w:pStyle w:val="BodyText"/>
         <w:spacing w:before="0" w:after="200" w:line="276" w:lineRule="auto"/>
         <w:jc w:val="both"/>
       </w:pPr>
@@ -3800,7 +4218,7 @@
     </w:p>
     <w:p>
       <w:pPr>
-        <w:pStyle w:val="FirstParagraph"/>
+        <w:pStyle w:val="BodyText"/>
         <w:spacing w:before="0" w:after="200" w:line="276" w:lineRule="auto"/>
         <w:jc w:val="both"/>
       </w:pPr>
@@ -3820,7 +4238,8 @@
           <w:ilvl w:val="0"/>
           <w:numId w:val="1001"/>
         </w:numPr>
-        <w:spacing w:before="0" w:after="200" w:line="276" w:lineRule="auto"/>
+        <w:spacing w:before="0" w:after="40" w:line="276" w:lineRule="auto"/>
+        <w:ind w:left="397" w:hanging="227"/>
         <w:jc w:val="left"/>
       </w:pPr>
       <w:r>
@@ -3839,7 +4258,8 @@
           <w:ilvl w:val="0"/>
           <w:numId w:val="1001"/>
         </w:numPr>
-        <w:spacing w:before="0" w:after="200" w:line="276" w:lineRule="auto"/>
+        <w:spacing w:before="0" w:after="40" w:line="276" w:lineRule="auto"/>
+        <w:ind w:left="397" w:hanging="227"/>
         <w:jc w:val="left"/>
       </w:pPr>
       <w:r>
@@ -3858,7 +4278,8 @@
           <w:ilvl w:val="0"/>
           <w:numId w:val="1001"/>
         </w:numPr>
-        <w:spacing w:before="0" w:after="200" w:line="276" w:lineRule="auto"/>
+        <w:spacing w:before="0" w:after="40" w:line="276" w:lineRule="auto"/>
+        <w:ind w:left="397" w:hanging="227"/>
         <w:jc w:val="left"/>
       </w:pPr>
       <w:r>
@@ -3877,7 +4298,8 @@
           <w:ilvl w:val="0"/>
           <w:numId w:val="1001"/>
         </w:numPr>
-        <w:spacing w:before="0" w:after="200" w:line="276" w:lineRule="auto"/>
+        <w:spacing w:before="0" w:after="40" w:line="276" w:lineRule="auto"/>
+        <w:ind w:left="397" w:hanging="227"/>
         <w:jc w:val="left"/>
       </w:pPr>
       <w:r>
@@ -3891,7 +4313,7 @@
     </w:p>
     <w:p>
       <w:pPr>
-        <w:pStyle w:val="FirstParagraph"/>
+        <w:pStyle w:val="BodyText"/>
         <w:spacing w:before="0" w:after="200" w:line="276" w:lineRule="auto"/>
         <w:jc w:val="both"/>
       </w:pPr>
@@ -3921,7 +4343,7 @@
     </w:p>
     <w:p>
       <w:pPr>
-        <w:pStyle w:val="FirstParagraph"/>
+        <w:pStyle w:val="BodyText"/>
         <w:spacing w:before="0" w:after="200" w:line="276" w:lineRule="auto"/>
         <w:jc w:val="both"/>
       </w:pPr>
@@ -3996,7 +4418,7 @@
     </w:p>
     <w:p>
       <w:pPr>
-        <w:pStyle w:val="FirstParagraph"/>
+        <w:pStyle w:val="BodyText"/>
         <w:spacing w:before="0" w:after="200" w:line="276" w:lineRule="auto"/>
         <w:jc w:val="both"/>
       </w:pPr>
@@ -4056,7 +4478,7 @@
     </w:p>
     <w:p>
       <w:pPr>
-        <w:pStyle w:val="FirstParagraph"/>
+        <w:pStyle w:val="BodyText"/>
         <w:spacing w:before="0" w:after="200" w:line="276" w:lineRule="auto"/>
         <w:jc w:val="both"/>
       </w:pPr>
@@ -4102,7 +4524,7 @@
     </w:p>
     <w:p>
       <w:pPr>
-        <w:pStyle w:val="FirstParagraph"/>
+        <w:pStyle w:val="BodyText"/>
         <w:spacing w:before="0" w:after="200" w:line="276" w:lineRule="auto"/>
         <w:jc w:val="both"/>
       </w:pPr>
@@ -4132,7 +4554,7 @@
     </w:p>
     <w:p>
       <w:pPr>
-        <w:pStyle w:val="FirstParagraph"/>
+        <w:pStyle w:val="BodyText"/>
         <w:spacing w:before="0" w:after="200" w:line="276" w:lineRule="auto"/>
         <w:jc w:val="both"/>
       </w:pPr>
@@ -4245,7 +4667,7 @@
     </w:p>
     <w:p>
       <w:pPr>
-        <w:pStyle w:val="FirstParagraph"/>
+        <w:pStyle w:val="BodyText"/>
         <w:spacing w:before="0" w:after="200" w:line="276" w:lineRule="auto"/>
         <w:jc w:val="both"/>
       </w:pPr>
@@ -4290,7 +4712,7 @@
     </w:p>
     <w:p>
       <w:pPr>
-        <w:pStyle w:val="FirstParagraph"/>
+        <w:pStyle w:val="BodyText"/>
         <w:spacing w:before="0" w:after="200" w:line="276" w:lineRule="auto"/>
         <w:jc w:val="both"/>
       </w:pPr>
@@ -4403,7 +4825,7 @@
     </w:p>
     <w:p>
       <w:pPr>
-        <w:pStyle w:val="FirstParagraph"/>
+        <w:pStyle w:val="BodyText"/>
         <w:spacing w:before="0" w:after="200" w:line="276" w:lineRule="auto"/>
         <w:jc w:val="both"/>
       </w:pPr>
@@ -4448,7 +4870,7 @@
     </w:p>
     <w:p>
       <w:pPr>
-        <w:pStyle w:val="FirstParagraph"/>
+        <w:pStyle w:val="BodyText"/>
         <w:spacing w:before="0" w:after="200" w:line="276" w:lineRule="auto"/>
         <w:jc w:val="both"/>
       </w:pPr>
@@ -4610,7 +5032,7 @@
     </w:p>
     <w:p>
       <w:pPr>
-        <w:pStyle w:val="FirstParagraph"/>
+        <w:pStyle w:val="BodyText"/>
         <w:spacing w:before="0" w:after="200" w:line="276" w:lineRule="auto"/>
         <w:jc w:val="both"/>
       </w:pPr>
@@ -4670,7 +5092,7 @@
     </w:p>
     <w:p>
       <w:pPr>
-        <w:pStyle w:val="FirstParagraph"/>
+        <w:pStyle w:val="BodyText"/>
         <w:spacing w:before="0" w:after="200" w:line="276" w:lineRule="auto"/>
         <w:jc w:val="both"/>
       </w:pPr>
@@ -4700,7 +5122,7 @@
     </w:p>
     <w:p>
       <w:pPr>
-        <w:pStyle w:val="FirstParagraph"/>
+        <w:pStyle w:val="BodyText"/>
         <w:spacing w:before="0" w:after="200" w:line="276" w:lineRule="auto"/>
         <w:jc w:val="both"/>
       </w:pPr>
@@ -4730,7 +5152,7 @@
     </w:p>
     <w:p>
       <w:pPr>
-        <w:pStyle w:val="FirstParagraph"/>
+        <w:pStyle w:val="BodyText"/>
         <w:spacing w:before="0" w:after="200" w:line="276" w:lineRule="auto"/>
         <w:jc w:val="both"/>
       </w:pPr>
@@ -4784,7 +5206,7 @@
     </w:p>
     <w:p>
       <w:pPr>
-        <w:pStyle w:val="FirstParagraph"/>
+        <w:pStyle w:val="BodyText"/>
         <w:spacing w:before="0" w:after="200" w:line="276" w:lineRule="auto"/>
         <w:jc w:val="both"/>
       </w:pPr>
@@ -4838,7 +5260,7 @@
     </w:p>
     <w:p>
       <w:pPr>
-        <w:pStyle w:val="FirstParagraph"/>
+        <w:pStyle w:val="BodyText"/>
         <w:spacing w:before="0" w:after="200" w:line="276" w:lineRule="auto"/>
         <w:jc w:val="both"/>
       </w:pPr>
@@ -4916,7 +5338,7 @@
     </w:p>
     <w:p>
       <w:pPr>
-        <w:pStyle w:val="FirstParagraph"/>
+        <w:pStyle w:val="BodyText"/>
         <w:spacing w:before="0" w:after="200" w:line="276" w:lineRule="auto"/>
         <w:jc w:val="both"/>
       </w:pPr>
@@ -5039,7 +5461,7 @@
     </w:p>
     <w:p>
       <w:pPr>
-        <w:pStyle w:val="FirstParagraph"/>
+        <w:pStyle w:val="BodyText"/>
         <w:spacing w:before="0" w:after="200" w:line="276" w:lineRule="auto"/>
         <w:jc w:val="both"/>
       </w:pPr>
@@ -5224,7 +5646,7 @@
     </w:p>
     <w:p>
       <w:pPr>
-        <w:pStyle w:val="FirstParagraph"/>
+        <w:pStyle w:val="BodyText"/>
         <w:spacing w:before="0" w:after="200" w:line="276" w:lineRule="auto"/>
         <w:jc w:val="both"/>
       </w:pPr>
@@ -5299,7 +5721,7 @@
     </w:p>
     <w:p>
       <w:pPr>
-        <w:pStyle w:val="FirstParagraph"/>
+        <w:pStyle w:val="BodyText"/>
         <w:spacing w:before="0" w:after="200" w:line="276" w:lineRule="auto"/>
         <w:jc w:val="both"/>
       </w:pPr>
@@ -5359,7 +5781,7 @@
     </w:p>
     <w:p>
       <w:pPr>
-        <w:pStyle w:val="FirstParagraph"/>
+        <w:pStyle w:val="BodyText"/>
         <w:spacing w:before="0" w:after="200" w:line="276" w:lineRule="auto"/>
         <w:jc w:val="both"/>
       </w:pPr>
@@ -5420,7 +5842,7 @@
     </w:p>
     <w:p>
       <w:pPr>
-        <w:pStyle w:val="FirstParagraph"/>
+        <w:pStyle w:val="BodyText"/>
         <w:spacing w:before="0" w:after="200" w:line="276" w:lineRule="auto"/>
         <w:jc w:val="both"/>
       </w:pPr>
@@ -5465,7 +5887,7 @@
     </w:p>
     <w:p>
       <w:pPr>
-        <w:pStyle w:val="FirstParagraph"/>
+        <w:pStyle w:val="BodyText"/>
         <w:spacing w:before="0" w:after="200" w:line="276" w:lineRule="auto"/>
         <w:jc w:val="both"/>
       </w:pPr>
@@ -6069,7 +6491,7 @@
     </w:p>
     <w:p>
       <w:pPr>
-        <w:pStyle w:val="FirstParagraph"/>
+        <w:pStyle w:val="BodyText"/>
         <w:spacing w:before="0" w:after="200" w:line="276" w:lineRule="auto"/>
         <w:jc w:val="both"/>
       </w:pPr>
@@ -6478,7 +6900,7 @@
     </w:p>
     <w:p>
       <w:pPr>
-        <w:pStyle w:val="FirstParagraph"/>
+        <w:pStyle w:val="BodyText"/>
         <w:spacing w:before="0" w:after="200" w:line="276" w:lineRule="auto"/>
         <w:jc w:val="both"/>
       </w:pPr>
@@ -6568,7 +6990,7 @@
     </w:p>
     <w:p>
       <w:pPr>
-        <w:pStyle w:val="FirstParagraph"/>
+        <w:pStyle w:val="BodyText"/>
         <w:spacing w:before="0" w:after="200" w:line="276" w:lineRule="auto"/>
         <w:jc w:val="both"/>
       </w:pPr>
@@ -6716,7 +7138,7 @@
     </w:p>
     <w:p>
       <w:pPr>
-        <w:pStyle w:val="FirstParagraph"/>
+        <w:pStyle w:val="BodyText"/>
         <w:spacing w:before="0" w:after="200" w:line="276" w:lineRule="auto"/>
         <w:jc w:val="both"/>
       </w:pPr>
@@ -6776,7 +7198,7 @@
     </w:p>
     <w:p>
       <w:pPr>
-        <w:pStyle w:val="FirstParagraph"/>
+        <w:pStyle w:val="BodyText"/>
         <w:spacing w:before="0" w:after="200" w:line="276" w:lineRule="auto"/>
         <w:jc w:val="both"/>
       </w:pPr>
@@ -7330,7 +7752,7 @@
     </w:p>
     <w:p>
       <w:pPr>
-        <w:pStyle w:val="FirstParagraph"/>
+        <w:pStyle w:val="BodyText"/>
         <w:spacing w:before="120" w:after="120" w:line="240" w:lineRule="auto"/>
         <w:jc w:val="center"/>
       </w:pPr>
@@ -9519,7 +9941,7 @@
     </w:p>
     <w:p>
       <w:pPr>
-        <w:pStyle w:val="FirstParagraph"/>
+        <w:pStyle w:val="BodyText"/>
         <w:spacing w:before="0" w:after="200" w:line="276" w:lineRule="auto"/>
         <w:jc w:val="both"/>
       </w:pPr>
@@ -9549,7 +9971,7 @@
     </w:p>
     <w:p>
       <w:pPr>
-        <w:pStyle w:val="FirstParagraph"/>
+        <w:pStyle w:val="BodyText"/>
         <w:spacing w:before="0" w:after="200" w:line="276" w:lineRule="auto"/>
         <w:jc w:val="both"/>
       </w:pPr>
@@ -9564,16 +9986,21 @@
     </w:p>
     <w:p>
       <w:pPr>
-        <w:pStyle w:val="Compact"/>
-        <w:numPr>
-          <w:ilvl w:val="0"/>
-          <w:numId w:val="1002"/>
-        </w:numPr>
-        <w:spacing w:before="0" w:after="200" w:line="276" w:lineRule="auto"/>
+        <w:pStyle w:val="BodyText"/>
+        <w:spacing w:before="0" w:after="40" w:line="276" w:lineRule="auto"/>
+        <w:ind w:left="397" w:hanging="227"/>
         <w:jc w:val="left"/>
       </w:pPr>
       <w:r>
         <w:rPr>
+          <w:rFonts w:ascii="Times New Roman" w:hAnsi="Times New Roman" w:eastAsia="Times New Roman" w:cs="Times New Roman"/>
+          <w:b w:val="0"/>
+          <w:sz w:val="24"/>
+        </w:rPr>
+        <w:t xml:space="preserve">• </w:t>
+      </w:r>
+      <w:r>
+        <w:rPr>
           <w:rFonts w:ascii="Times New Roman" w:hAnsi="Times New Roman" w:eastAsia="Times New Roman"/>
           <w:b w:val="0"/>
           <w:sz w:val="24"/>
@@ -9583,16 +10010,21 @@
     </w:p>
     <w:p>
       <w:pPr>
-        <w:pStyle w:val="Compact"/>
-        <w:numPr>
-          <w:ilvl w:val="0"/>
-          <w:numId w:val="1002"/>
-        </w:numPr>
-        <w:spacing w:before="0" w:after="200" w:line="276" w:lineRule="auto"/>
+        <w:pStyle w:val="BodyText"/>
+        <w:spacing w:before="0" w:after="40" w:line="276" w:lineRule="auto"/>
+        <w:ind w:left="397" w:hanging="227"/>
         <w:jc w:val="left"/>
       </w:pPr>
       <w:r>
         <w:rPr>
+          <w:rFonts w:ascii="Times New Roman" w:hAnsi="Times New Roman" w:eastAsia="Times New Roman" w:cs="Times New Roman"/>
+          <w:b w:val="0"/>
+          <w:sz w:val="24"/>
+        </w:rPr>
+        <w:t xml:space="preserve">• </w:t>
+      </w:r>
+      <w:r>
+        <w:rPr>
           <w:rFonts w:ascii="Times New Roman" w:hAnsi="Times New Roman" w:eastAsia="Times New Roman"/>
           <w:b w:val="0"/>
           <w:sz w:val="24"/>
@@ -9602,16 +10034,21 @@
     </w:p>
     <w:p>
       <w:pPr>
-        <w:pStyle w:val="Compact"/>
-        <w:numPr>
-          <w:ilvl w:val="0"/>
-          <w:numId w:val="1002"/>
-        </w:numPr>
-        <w:spacing w:before="0" w:after="200" w:line="276" w:lineRule="auto"/>
+        <w:pStyle w:val="BodyText"/>
+        <w:spacing w:before="0" w:after="40" w:line="276" w:lineRule="auto"/>
+        <w:ind w:left="397" w:hanging="227"/>
         <w:jc w:val="left"/>
       </w:pPr>
       <w:r>
         <w:rPr>
+          <w:rFonts w:ascii="Times New Roman" w:hAnsi="Times New Roman" w:eastAsia="Times New Roman" w:cs="Times New Roman"/>
+          <w:b w:val="0"/>
+          <w:sz w:val="24"/>
+        </w:rPr>
+        <w:t xml:space="preserve">• </w:t>
+      </w:r>
+      <w:r>
+        <w:rPr>
           <w:rFonts w:ascii="Times New Roman" w:hAnsi="Times New Roman" w:eastAsia="Times New Roman"/>
           <w:b w:val="0"/>
           <w:sz w:val="24"/>
@@ -9621,16 +10058,21 @@
     </w:p>
     <w:p>
       <w:pPr>
-        <w:pStyle w:val="Compact"/>
-        <w:numPr>
-          <w:ilvl w:val="0"/>
-          <w:numId w:val="1002"/>
-        </w:numPr>
-        <w:spacing w:before="0" w:after="200" w:line="276" w:lineRule="auto"/>
+        <w:pStyle w:val="BodyText"/>
+        <w:spacing w:before="0" w:after="40" w:line="276" w:lineRule="auto"/>
+        <w:ind w:left="397" w:hanging="227"/>
         <w:jc w:val="left"/>
       </w:pPr>
       <w:r>
         <w:rPr>
+          <w:rFonts w:ascii="Times New Roman" w:hAnsi="Times New Roman" w:eastAsia="Times New Roman" w:cs="Times New Roman"/>
+          <w:b w:val="0"/>
+          <w:sz w:val="24"/>
+        </w:rPr>
+        <w:t xml:space="preserve">• </w:t>
+      </w:r>
+      <w:r>
+        <w:rPr>
           <w:rFonts w:ascii="Times New Roman" w:hAnsi="Times New Roman" w:eastAsia="Times New Roman"/>
           <w:b w:val="0"/>
           <w:sz w:val="24"/>
@@ -9640,16 +10082,21 @@
     </w:p>
     <w:p>
       <w:pPr>
-        <w:pStyle w:val="Compact"/>
-        <w:numPr>
-          <w:ilvl w:val="0"/>
-          <w:numId w:val="1002"/>
-        </w:numPr>
-        <w:spacing w:before="0" w:after="200" w:line="276" w:lineRule="auto"/>
+        <w:pStyle w:val="BodyText"/>
+        <w:spacing w:before="0" w:after="40" w:line="276" w:lineRule="auto"/>
+        <w:ind w:left="397" w:hanging="227"/>
         <w:jc w:val="left"/>
       </w:pPr>
       <w:r>
         <w:rPr>
+          <w:rFonts w:ascii="Times New Roman" w:hAnsi="Times New Roman" w:eastAsia="Times New Roman" w:cs="Times New Roman"/>
+          <w:b w:val="0"/>
+          <w:sz w:val="24"/>
+        </w:rPr>
+        <w:t xml:space="preserve">• </w:t>
+      </w:r>
+      <w:r>
+        <w:rPr>
           <w:rFonts w:ascii="Times New Roman" w:hAnsi="Times New Roman" w:eastAsia="Times New Roman"/>
           <w:b w:val="0"/>
           <w:sz w:val="24"/>
@@ -9659,16 +10106,21 @@
     </w:p>
     <w:p>
       <w:pPr>
-        <w:pStyle w:val="Compact"/>
-        <w:numPr>
-          <w:ilvl w:val="0"/>
-          <w:numId w:val="1002"/>
-        </w:numPr>
-        <w:spacing w:before="0" w:after="200" w:line="276" w:lineRule="auto"/>
+        <w:pStyle w:val="BodyText"/>
+        <w:spacing w:before="0" w:after="40" w:line="276" w:lineRule="auto"/>
+        <w:ind w:left="397" w:hanging="227"/>
         <w:jc w:val="left"/>
       </w:pPr>
       <w:r>
         <w:rPr>
+          <w:rFonts w:ascii="Times New Roman" w:hAnsi="Times New Roman" w:eastAsia="Times New Roman" w:cs="Times New Roman"/>
+          <w:b w:val="0"/>
+          <w:sz w:val="24"/>
+        </w:rPr>
+        <w:t xml:space="preserve">• </w:t>
+      </w:r>
+      <w:r>
+        <w:rPr>
           <w:rFonts w:ascii="Times New Roman" w:hAnsi="Times New Roman" w:eastAsia="Times New Roman"/>
           <w:b w:val="0"/>
           <w:sz w:val="24"/>
@@ -9678,7 +10130,7 @@
     </w:p>
     <w:p>
       <w:pPr>
-        <w:pStyle w:val="FirstParagraph"/>
+        <w:pStyle w:val="BodyText"/>
         <w:spacing w:before="0" w:after="200" w:line="276" w:lineRule="auto"/>
         <w:jc w:val="both"/>
       </w:pPr>
@@ -10205,7 +10657,7 @@
     </w:p>
     <w:p>
       <w:pPr>
-        <w:pStyle w:val="FirstParagraph"/>
+        <w:pStyle w:val="BodyText"/>
         <w:spacing w:before="0" w:after="200" w:line="276" w:lineRule="auto"/>
         <w:jc w:val="both"/>
       </w:pPr>
@@ -11450,7 +11902,7 @@
     </w:p>
     <w:p>
       <w:pPr>
-        <w:pStyle w:val="FirstParagraph"/>
+        <w:pStyle w:val="BodyText"/>
         <w:spacing w:before="0" w:after="200" w:line="276" w:lineRule="auto"/>
         <w:jc w:val="both"/>
       </w:pPr>
@@ -11465,16 +11917,21 @@
     </w:p>
     <w:p>
       <w:pPr>
-        <w:pStyle w:val="Compact"/>
-        <w:numPr>
-          <w:ilvl w:val="0"/>
-          <w:numId w:val="1003"/>
-        </w:numPr>
-        <w:spacing w:before="0" w:after="200" w:line="276" w:lineRule="auto"/>
+        <w:pStyle w:val="BodyText"/>
+        <w:spacing w:before="0" w:after="40" w:line="276" w:lineRule="auto"/>
+        <w:ind w:left="397" w:hanging="227"/>
         <w:jc w:val="left"/>
       </w:pPr>
       <w:r>
         <w:rPr>
+          <w:rFonts w:ascii="Times New Roman" w:hAnsi="Times New Roman" w:eastAsia="Times New Roman" w:cs="Times New Roman"/>
+          <w:b w:val="0"/>
+          <w:sz w:val="24"/>
+        </w:rPr>
+        <w:t xml:space="preserve">• </w:t>
+      </w:r>
+      <w:r>
+        <w:rPr>
           <w:rFonts w:ascii="Times New Roman" w:hAnsi="Times New Roman" w:eastAsia="Times New Roman"/>
           <w:b w:val="0"/>
           <w:sz w:val="24"/>
@@ -11484,16 +11941,21 @@
     </w:p>
     <w:p>
       <w:pPr>
-        <w:pStyle w:val="Compact"/>
-        <w:numPr>
-          <w:ilvl w:val="0"/>
-          <w:numId w:val="1003"/>
-        </w:numPr>
-        <w:spacing w:before="0" w:after="200" w:line="276" w:lineRule="auto"/>
+        <w:pStyle w:val="BodyText"/>
+        <w:spacing w:before="0" w:after="40" w:line="276" w:lineRule="auto"/>
+        <w:ind w:left="397" w:hanging="227"/>
         <w:jc w:val="left"/>
       </w:pPr>
       <w:r>
         <w:rPr>
+          <w:rFonts w:ascii="Times New Roman" w:hAnsi="Times New Roman" w:eastAsia="Times New Roman" w:cs="Times New Roman"/>
+          <w:b w:val="0"/>
+          <w:sz w:val="24"/>
+        </w:rPr>
+        <w:t xml:space="preserve">• </w:t>
+      </w:r>
+      <w:r>
+        <w:rPr>
           <w:rFonts w:ascii="Times New Roman" w:hAnsi="Times New Roman" w:eastAsia="Times New Roman"/>
           <w:b w:val="0"/>
           <w:sz w:val="24"/>
@@ -11503,16 +11965,21 @@
     </w:p>
     <w:p>
       <w:pPr>
-        <w:pStyle w:val="Compact"/>
-        <w:numPr>
-          <w:ilvl w:val="0"/>
-          <w:numId w:val="1003"/>
-        </w:numPr>
-        <w:spacing w:before="0" w:after="200" w:line="276" w:lineRule="auto"/>
+        <w:pStyle w:val="BodyText"/>
+        <w:spacing w:before="0" w:after="40" w:line="276" w:lineRule="auto"/>
+        <w:ind w:left="397" w:hanging="227"/>
         <w:jc w:val="left"/>
       </w:pPr>
       <w:r>
         <w:rPr>
+          <w:rFonts w:ascii="Times New Roman" w:hAnsi="Times New Roman" w:eastAsia="Times New Roman" w:cs="Times New Roman"/>
+          <w:b w:val="0"/>
+          <w:sz w:val="24"/>
+        </w:rPr>
+        <w:t xml:space="preserve">• </w:t>
+      </w:r>
+      <w:r>
+        <w:rPr>
           <w:rFonts w:ascii="Times New Roman" w:hAnsi="Times New Roman" w:eastAsia="Times New Roman"/>
           <w:b w:val="0"/>
           <w:sz w:val="24"/>
@@ -11522,16 +11989,21 @@
     </w:p>
     <w:p>
       <w:pPr>
-        <w:pStyle w:val="Compact"/>
-        <w:numPr>
-          <w:ilvl w:val="0"/>
-          <w:numId w:val="1003"/>
-        </w:numPr>
-        <w:spacing w:before="0" w:after="200" w:line="276" w:lineRule="auto"/>
+        <w:pStyle w:val="BodyText"/>
+        <w:spacing w:before="0" w:after="40" w:line="276" w:lineRule="auto"/>
+        <w:ind w:left="397" w:hanging="227"/>
         <w:jc w:val="left"/>
       </w:pPr>
       <w:r>
         <w:rPr>
+          <w:rFonts w:ascii="Times New Roman" w:hAnsi="Times New Roman" w:eastAsia="Times New Roman" w:cs="Times New Roman"/>
+          <w:b w:val="0"/>
+          <w:sz w:val="24"/>
+        </w:rPr>
+        <w:t xml:space="preserve">• </w:t>
+      </w:r>
+      <w:r>
+        <w:rPr>
           <w:rFonts w:ascii="Times New Roman" w:hAnsi="Times New Roman" w:eastAsia="Times New Roman"/>
           <w:b w:val="0"/>
           <w:sz w:val="24"/>
@@ -11541,7 +12013,7 @@
     </w:p>
     <w:p>
       <w:pPr>
-        <w:pStyle w:val="FirstParagraph"/>
+        <w:pStyle w:val="BodyText"/>
         <w:spacing w:before="0" w:after="200" w:line="276" w:lineRule="auto"/>
         <w:jc w:val="both"/>
       </w:pPr>
@@ -11586,7 +12058,7 @@
     </w:p>
     <w:p>
       <w:pPr>
-        <w:pStyle w:val="FirstParagraph"/>
+        <w:pStyle w:val="BodyText"/>
         <w:spacing w:before="0" w:after="200" w:line="276" w:lineRule="auto"/>
         <w:jc w:val="both"/>
       </w:pPr>
@@ -11647,7 +12119,7 @@
     </w:p>
     <w:p>
       <w:pPr>
-        <w:pStyle w:val="FirstParagraph"/>
+        <w:pStyle w:val="BodyText"/>
         <w:spacing w:before="0" w:after="200" w:line="276" w:lineRule="auto"/>
         <w:jc w:val="both"/>
       </w:pPr>
@@ -11677,7 +12149,7 @@
     </w:p>
     <w:p>
       <w:pPr>
-        <w:pStyle w:val="FirstParagraph"/>
+        <w:pStyle w:val="BodyText"/>
         <w:spacing w:before="0" w:after="200" w:line="276" w:lineRule="auto"/>
         <w:jc w:val="both"/>
       </w:pPr>
@@ -11722,7 +12194,7 @@
     </w:p>
     <w:p>
       <w:pPr>
-        <w:pStyle w:val="FirstParagraph"/>
+        <w:pStyle w:val="BodyText"/>
         <w:spacing w:before="0" w:after="200" w:line="276" w:lineRule="auto"/>
         <w:jc w:val="both"/>
       </w:pPr>
@@ -11782,7 +12254,7 @@
     </w:p>
     <w:p>
       <w:pPr>
-        <w:pStyle w:val="FirstParagraph"/>
+        <w:pStyle w:val="BodyText"/>
         <w:spacing w:before="0" w:after="200" w:line="276" w:lineRule="auto"/>
         <w:jc w:val="both"/>
       </w:pPr>
@@ -11817,7 +12289,8 @@
           <w:ilvl w:val="0"/>
           <w:numId w:val="1004"/>
         </w:numPr>
-        <w:spacing w:before="0" w:after="200" w:line="276" w:lineRule="auto"/>
+        <w:spacing w:before="0" w:after="40" w:line="276" w:lineRule="auto"/>
+        <w:ind w:left="397" w:hanging="227"/>
         <w:jc w:val="left"/>
       </w:pPr>
       <w:r>
@@ -11836,7 +12309,8 @@
           <w:ilvl w:val="0"/>
           <w:numId w:val="1004"/>
         </w:numPr>
-        <w:spacing w:before="0" w:after="200" w:line="276" w:lineRule="auto"/>
+        <w:spacing w:before="0" w:after="40" w:line="276" w:lineRule="auto"/>
+        <w:ind w:left="397" w:hanging="227"/>
         <w:jc w:val="left"/>
       </w:pPr>
       <w:r>
@@ -11850,7 +12324,7 @@
     </w:p>
     <w:p>
       <w:pPr>
-        <w:pStyle w:val="FirstParagraph"/>
+        <w:pStyle w:val="BodyText"/>
         <w:spacing w:before="0" w:after="200" w:line="276" w:lineRule="auto"/>
         <w:jc w:val="both"/>
       </w:pPr>
@@ -11976,7 +12450,7 @@
     </w:p>
     <w:p>
       <w:pPr>
-        <w:pStyle w:val="FirstParagraph"/>
+        <w:pStyle w:val="BodyText"/>
         <w:spacing w:before="0" w:after="200" w:line="276" w:lineRule="auto"/>
         <w:jc w:val="both"/>
       </w:pPr>
@@ -12617,7 +13091,7 @@
     </w:p>
     <w:p>
       <w:pPr>
-        <w:pStyle w:val="FirstParagraph"/>
+        <w:pStyle w:val="BodyText"/>
         <w:spacing w:before="0" w:after="200" w:line="276" w:lineRule="auto"/>
         <w:jc w:val="both"/>
       </w:pPr>
@@ -12712,7 +13186,7 @@
     </w:p>
     <w:p>
       <w:pPr>
-        <w:pStyle w:val="FirstParagraph"/>
+        <w:pStyle w:val="BodyText"/>
         <w:spacing w:before="120" w:after="120" w:line="240" w:lineRule="auto"/>
         <w:jc w:val="center"/>
       </w:pPr>
@@ -12913,7 +13387,7 @@
     </w:p>
     <w:p>
       <w:pPr>
-        <w:pStyle w:val="FirstParagraph"/>
+        <w:pStyle w:val="BodyText"/>
         <w:spacing w:before="0" w:after="200" w:line="276" w:lineRule="auto"/>
         <w:jc w:val="both"/>
       </w:pPr>
@@ -13167,7 +13641,7 @@
     </w:p>
     <w:p>
       <w:pPr>
-        <w:pStyle w:val="FirstParagraph"/>
+        <w:pStyle w:val="BodyText"/>
         <w:spacing w:before="0" w:after="200" w:line="276" w:lineRule="auto"/>
         <w:jc w:val="both"/>
       </w:pPr>
@@ -13397,7 +13871,7 @@
     </w:p>
     <w:p>
       <w:pPr>
-        <w:pStyle w:val="FirstParagraph"/>
+        <w:pStyle w:val="BodyText"/>
         <w:spacing w:before="0" w:after="200" w:line="276" w:lineRule="auto"/>
         <w:jc w:val="both"/>
       </w:pPr>
@@ -13530,7 +14004,7 @@
     </w:p>
     <w:p>
       <w:pPr>
-        <w:pStyle w:val="FirstParagraph"/>
+        <w:pStyle w:val="BodyText"/>
         <w:spacing w:before="0" w:after="200" w:line="276" w:lineRule="auto"/>
         <w:jc w:val="both"/>
       </w:pPr>
@@ -13590,7 +14064,7 @@
     </w:p>
     <w:p>
       <w:pPr>
-        <w:pStyle w:val="FirstParagraph"/>
+        <w:pStyle w:val="BodyText"/>
         <w:spacing w:before="0" w:after="200" w:line="276" w:lineRule="auto"/>
         <w:jc w:val="both"/>
       </w:pPr>
@@ -13690,7 +14164,7 @@
     </w:p>
     <w:p>
       <w:pPr>
-        <w:pStyle w:val="FirstParagraph"/>
+        <w:pStyle w:val="BodyText"/>
         <w:spacing w:before="0" w:after="200" w:line="276" w:lineRule="auto"/>
         <w:jc w:val="both"/>
       </w:pPr>
@@ -13750,7 +14224,7 @@
     </w:p>
     <w:p>
       <w:pPr>
-        <w:pStyle w:val="FirstParagraph"/>
+        <w:pStyle w:val="BodyText"/>
         <w:spacing w:before="0" w:after="200" w:line="276" w:lineRule="auto"/>
         <w:jc w:val="both"/>
       </w:pPr>
@@ -13765,16 +14239,21 @@
     </w:p>
     <w:p>
       <w:pPr>
-        <w:pStyle w:val="Compact"/>
-        <w:numPr>
-          <w:ilvl w:val="0"/>
-          <w:numId w:val="1005"/>
-        </w:numPr>
-        <w:spacing w:before="0" w:after="200" w:line="276" w:lineRule="auto"/>
+        <w:pStyle w:val="BodyText"/>
+        <w:spacing w:before="0" w:after="40" w:line="276" w:lineRule="auto"/>
+        <w:ind w:left="397" w:hanging="227"/>
         <w:jc w:val="left"/>
       </w:pPr>
       <w:r>
         <w:rPr>
+          <w:rFonts w:ascii="Times New Roman" w:hAnsi="Times New Roman" w:eastAsia="Times New Roman" w:cs="Times New Roman"/>
+          <w:b w:val="0"/>
+          <w:sz w:val="24"/>
+        </w:rPr>
+        <w:t xml:space="preserve">• </w:t>
+      </w:r>
+      <w:r>
+        <w:rPr>
           <w:rFonts w:ascii="Times New Roman" w:hAnsi="Times New Roman" w:eastAsia="Times New Roman"/>
           <w:b w:val="0"/>
           <w:sz w:val="24"/>
@@ -13784,16 +14263,21 @@
     </w:p>
     <w:p>
       <w:pPr>
-        <w:pStyle w:val="Compact"/>
-        <w:numPr>
-          <w:ilvl w:val="0"/>
-          <w:numId w:val="1005"/>
-        </w:numPr>
-        <w:spacing w:before="0" w:after="200" w:line="276" w:lineRule="auto"/>
+        <w:pStyle w:val="BodyText"/>
+        <w:spacing w:before="0" w:after="40" w:line="276" w:lineRule="auto"/>
+        <w:ind w:left="397" w:hanging="227"/>
         <w:jc w:val="left"/>
       </w:pPr>
       <w:r>
         <w:rPr>
+          <w:rFonts w:ascii="Times New Roman" w:hAnsi="Times New Roman" w:eastAsia="Times New Roman" w:cs="Times New Roman"/>
+          <w:b w:val="0"/>
+          <w:sz w:val="24"/>
+        </w:rPr>
+        <w:t xml:space="preserve">• </w:t>
+      </w:r>
+      <w:r>
+        <w:rPr>
           <w:rFonts w:ascii="Times New Roman" w:hAnsi="Times New Roman" w:eastAsia="Times New Roman"/>
           <w:b w:val="0"/>
           <w:sz w:val="24"/>
@@ -13803,7 +14287,7 @@
     </w:p>
     <w:p>
       <w:pPr>
-        <w:pStyle w:val="FirstParagraph"/>
+        <w:pStyle w:val="BodyText"/>
         <w:spacing w:before="0" w:after="200" w:line="276" w:lineRule="auto"/>
         <w:jc w:val="both"/>
       </w:pPr>
@@ -13864,7 +14348,7 @@
     </w:p>
     <w:p>
       <w:pPr>
-        <w:pStyle w:val="FirstParagraph"/>
+        <w:pStyle w:val="BodyText"/>
         <w:spacing w:before="0" w:after="200" w:line="276" w:lineRule="auto"/>
         <w:jc w:val="both"/>
       </w:pPr>
@@ -13894,7 +14378,7 @@
     </w:p>
     <w:p>
       <w:pPr>
-        <w:pStyle w:val="FirstParagraph"/>
+        <w:pStyle w:val="BodyText"/>
         <w:spacing w:before="0" w:after="200" w:line="276" w:lineRule="auto"/>
         <w:jc w:val="both"/>
       </w:pPr>
@@ -13954,7 +14438,7 @@
     </w:p>
     <w:p>
       <w:pPr>
-        <w:pStyle w:val="FirstParagraph"/>
+        <w:pStyle w:val="BodyText"/>
         <w:spacing w:before="0" w:after="200" w:line="276" w:lineRule="auto"/>
         <w:jc w:val="both"/>
       </w:pPr>
@@ -15015,14 +15499,18 @@
     </w:p>
     <w:p>
       <w:pPr>
-        <w:pStyle w:val="Compact"/>
-        <w:numPr>
-          <w:ilvl w:val="0"/>
-          <w:numId w:val="1006"/>
-        </w:numPr>
+        <w:pStyle w:val="BodyText"/>
         <w:spacing w:before="120" w:after="120" w:line="240" w:lineRule="auto"/>
         <w:jc w:val="center"/>
       </w:pPr>
+      <w:r>
+        <w:rPr>
+          <w:rFonts w:ascii="Times New Roman" w:hAnsi="Times New Roman" w:eastAsia="Times New Roman" w:cs="Times New Roman"/>
+          <w:b w:val="0"/>
+          <w:sz w:val="24"/>
+        </w:rPr>
+        <w:t xml:space="preserve">• </w:t>
+      </w:r>
       <m:oMath>
         <m:sSub>
           <m:e>
@@ -15065,14 +15553,18 @@
     </w:p>
     <w:p>
       <w:pPr>
-        <w:pStyle w:val="Compact"/>
-        <w:numPr>
-          <w:ilvl w:val="0"/>
-          <w:numId w:val="1006"/>
-        </w:numPr>
+        <w:pStyle w:val="BodyText"/>
         <w:spacing w:before="120" w:after="120" w:line="240" w:lineRule="auto"/>
         <w:jc w:val="center"/>
       </w:pPr>
+      <w:r>
+        <w:rPr>
+          <w:rFonts w:ascii="Times New Roman" w:hAnsi="Times New Roman" w:eastAsia="Times New Roman" w:cs="Times New Roman"/>
+          <w:b w:val="0"/>
+          <w:sz w:val="24"/>
+        </w:rPr>
+        <w:t xml:space="preserve">• </w:t>
+      </w:r>
       <m:oMath>
         <m:sSub>
           <m:e>
@@ -15115,14 +15607,18 @@
     </w:p>
     <w:p>
       <w:pPr>
-        <w:pStyle w:val="Compact"/>
-        <w:numPr>
-          <w:ilvl w:val="0"/>
-          <w:numId w:val="1006"/>
-        </w:numPr>
+        <w:pStyle w:val="BodyText"/>
         <w:spacing w:before="120" w:after="120" w:line="240" w:lineRule="auto"/>
         <w:jc w:val="center"/>
       </w:pPr>
+      <w:r>
+        <w:rPr>
+          <w:rFonts w:ascii="Times New Roman" w:hAnsi="Times New Roman" w:eastAsia="Times New Roman" w:cs="Times New Roman"/>
+          <w:b w:val="0"/>
+          <w:sz w:val="24"/>
+        </w:rPr>
+        <w:t xml:space="preserve">• </w:t>
+      </w:r>
       <m:oMath>
         <m:sSub>
           <m:e>
@@ -15165,14 +15661,18 @@
     </w:p>
     <w:p>
       <w:pPr>
-        <w:pStyle w:val="Compact"/>
-        <w:numPr>
-          <w:ilvl w:val="0"/>
-          <w:numId w:val="1006"/>
-        </w:numPr>
+        <w:pStyle w:val="BodyText"/>
         <w:spacing w:before="120" w:after="120" w:line="240" w:lineRule="auto"/>
         <w:jc w:val="center"/>
       </w:pPr>
+      <w:r>
+        <w:rPr>
+          <w:rFonts w:ascii="Times New Roman" w:hAnsi="Times New Roman" w:eastAsia="Times New Roman" w:cs="Times New Roman"/>
+          <w:b w:val="0"/>
+          <w:sz w:val="24"/>
+        </w:rPr>
+        <w:t xml:space="preserve">• </w:t>
+      </w:r>
       <m:oMath>
         <m:sSubSup>
           <m:e>
@@ -15220,7 +15720,7 @@
     </w:p>
     <w:p>
       <w:pPr>
-        <w:pStyle w:val="FirstParagraph"/>
+        <w:pStyle w:val="BodyText"/>
         <w:spacing w:before="0" w:after="200" w:line="276" w:lineRule="auto"/>
         <w:jc w:val="both"/>
       </w:pPr>
@@ -15338,7 +15838,7 @@
     </w:p>
     <w:p>
       <w:pPr>
-        <w:pStyle w:val="FirstParagraph"/>
+        <w:pStyle w:val="BodyText"/>
         <w:spacing w:before="0" w:after="200" w:line="276" w:lineRule="auto"/>
         <w:jc w:val="both"/>
       </w:pPr>
@@ -15513,7 +16013,7 @@
     </w:p>
     <w:p>
       <w:pPr>
-        <w:pStyle w:val="FirstParagraph"/>
+        <w:pStyle w:val="BodyText"/>
         <w:spacing w:before="0" w:after="200" w:line="276" w:lineRule="auto"/>
         <w:jc w:val="both"/>
       </w:pPr>
@@ -15723,7 +16223,7 @@
     </w:p>
     <w:p>
       <w:pPr>
-        <w:pStyle w:val="FirstParagraph"/>
+        <w:pStyle w:val="BodyText"/>
         <w:spacing w:before="0" w:after="200" w:line="276" w:lineRule="auto"/>
         <w:jc w:val="both"/>
       </w:pPr>
@@ -15949,7 +16449,7 @@
     </w:p>
     <w:p>
       <w:pPr>
-        <w:pStyle w:val="FirstParagraph"/>
+        <w:pStyle w:val="BodyText"/>
         <w:spacing w:before="120" w:after="120" w:line="240" w:lineRule="auto"/>
         <w:jc w:val="center"/>
       </w:pPr>
@@ -16157,7 +16657,7 @@
     </w:p>
     <w:p>
       <w:pPr>
-        <w:pStyle w:val="FirstParagraph"/>
+        <w:pStyle w:val="BodyText"/>
         <w:spacing w:before="0" w:after="200" w:line="276" w:lineRule="auto"/>
         <w:jc w:val="both"/>
       </w:pPr>
@@ -16317,7 +16817,7 @@
     </w:p>
     <w:p>
       <w:pPr>
-        <w:pStyle w:val="FirstParagraph"/>
+        <w:pStyle w:val="BodyText"/>
         <w:spacing w:before="120" w:after="120" w:line="240" w:lineRule="auto"/>
         <w:jc w:val="center"/>
       </w:pPr>
@@ -16552,7 +17052,7 @@
     </w:p>
     <w:p>
       <w:pPr>
-        <w:pStyle w:val="FirstParagraph"/>
+        <w:pStyle w:val="BodyText"/>
         <w:spacing w:before="120" w:after="120" w:line="240" w:lineRule="auto"/>
         <w:jc w:val="center"/>
       </w:pPr>
@@ -16762,7 +17262,7 @@
     </w:p>
     <w:p>
       <w:pPr>
-        <w:pStyle w:val="FirstParagraph"/>
+        <w:pStyle w:val="BodyText"/>
         <w:spacing w:before="0" w:after="200" w:line="276" w:lineRule="auto"/>
         <w:jc w:val="both"/>
       </w:pPr>
@@ -17082,7 +17582,7 @@
     </w:p>
     <w:p>
       <w:pPr>
-        <w:pStyle w:val="FirstParagraph"/>
+        <w:pStyle w:val="BodyText"/>
         <w:spacing w:before="120" w:after="120" w:line="240" w:lineRule="auto"/>
         <w:jc w:val="center"/>
       </w:pPr>
@@ -17205,7 +17705,7 @@
     </w:p>
     <w:p>
       <w:pPr>
-        <w:pStyle w:val="FirstParagraph"/>
+        <w:pStyle w:val="BodyText"/>
         <w:spacing w:before="0" w:after="200" w:line="276" w:lineRule="auto"/>
         <w:jc w:val="both"/>
       </w:pPr>
@@ -18180,7 +18680,7 @@
     </w:p>
     <w:p>
       <w:pPr>
-        <w:pStyle w:val="FirstParagraph"/>
+        <w:pStyle w:val="BodyText"/>
         <w:spacing w:before="0" w:after="200" w:line="276" w:lineRule="auto"/>
         <w:jc w:val="both"/>
       </w:pPr>
@@ -18240,7 +18740,7 @@
     </w:p>
     <w:p>
       <w:pPr>
-        <w:pStyle w:val="FirstParagraph"/>
+        <w:pStyle w:val="BodyText"/>
         <w:spacing w:before="0" w:after="200" w:line="276" w:lineRule="auto"/>
         <w:jc w:val="both"/>
       </w:pPr>
@@ -18627,7 +19127,7 @@
     </w:p>
     <w:p>
       <w:pPr>
-        <w:pStyle w:val="FirstParagraph"/>
+        <w:pStyle w:val="BodyText"/>
         <w:spacing w:before="0" w:after="200" w:line="276" w:lineRule="auto"/>
         <w:jc w:val="both"/>
       </w:pPr>
@@ -20655,7 +21155,7 @@
     </w:p>
     <w:p>
       <w:pPr>
-        <w:pStyle w:val="FirstParagraph"/>
+        <w:pStyle w:val="BodyText"/>
         <w:spacing w:before="0" w:after="200" w:line="276" w:lineRule="auto"/>
         <w:jc w:val="both"/>
       </w:pPr>
@@ -20716,7 +21216,7 @@
     </w:p>
     <w:p>
       <w:pPr>
-        <w:pStyle w:val="FirstParagraph"/>
+        <w:pStyle w:val="BodyText"/>
         <w:spacing w:before="0" w:after="200" w:line="276" w:lineRule="auto"/>
         <w:jc w:val="both"/>
       </w:pPr>
@@ -20746,7 +21246,7 @@
     </w:p>
     <w:p>
       <w:pPr>
-        <w:pStyle w:val="FirstParagraph"/>
+        <w:pStyle w:val="BodyText"/>
         <w:spacing w:before="0" w:after="200" w:line="276" w:lineRule="auto"/>
         <w:jc w:val="both"/>
       </w:pPr>
@@ -22074,6 +22574,21 @@
           <w:sz w:val="24"/>
         </w:rPr>
         <w:t xml:space="preserve">The reported experiment does not use 2023–2025 outcomes for fitting, tuning, calibration or model selection. However, these years were examined during earlier project development, and the broader outcome definition was specified after that work. The later evaluation is therefore retrospective rather than an untouched external validation.</w:t>
+      </w:r>
+    </w:p>
+    <w:p>
+      <w:pPr>
+        <w:pStyle w:val="BodyText"/>
+        <w:spacing w:before="0" w:after="200" w:line="276" w:lineRule="auto"/>
+        <w:jc w:val="both"/>
+      </w:pPr>
+      <w:r>
+        <w:rPr>
+          <w:rFonts w:ascii="Times New Roman" w:hAnsi="Times New Roman" w:eastAsia="Times New Roman"/>
+          <w:b w:val="0"/>
+          <w:sz w:val="24"/>
+        </w:rPr>
+        <w:t xml:space="preserve">Figure 1 summarizes annual sample coverage and the share of positive labels before chronological purging.</w:t>
       </w:r>
     </w:p>
     <w:p>
@@ -22139,7 +22654,7 @@
           <w:iCs/>
           <w:sz w:val="24"/>
         </w:rPr>
-        <w:t xml:space="preserve">Figure 1. Labeled panel before chronological purging. Positive rows are monthly prediction outcomes, not separate episodes. Source: primary model experiment panel audit and descriptive report.</w:t>
+        <w:t xml:space="preserve">Figure 1. Sample coverage and positive-label share.</w:t>
       </w:r>
     </w:p>
     <w:p>
@@ -22159,7 +22674,7 @@
     </w:p>
     <w:p>
       <w:pPr>
-        <w:pStyle w:val="FirstParagraph"/>
+        <w:pStyle w:val="BodyText"/>
         <w:spacing w:before="0" w:after="200" w:line="276" w:lineRule="auto"/>
         <w:jc w:val="both"/>
       </w:pPr>
@@ -22554,7 +23069,7 @@
     </w:p>
     <w:p>
       <w:pPr>
-        <w:pStyle w:val="FirstParagraph"/>
+        <w:pStyle w:val="BodyText"/>
         <w:spacing w:before="0" w:after="200" w:line="276" w:lineRule="auto"/>
         <w:jc w:val="both"/>
       </w:pPr>
@@ -23642,7 +24157,7 @@
     </w:p>
     <w:p>
       <w:pPr>
-        <w:pStyle w:val="FirstParagraph"/>
+        <w:pStyle w:val="BodyText"/>
         <w:spacing w:before="0" w:after="200" w:line="276" w:lineRule="auto"/>
         <w:jc w:val="both"/>
       </w:pPr>
@@ -25346,6 +25861,21 @@
           <w:sz w:val="24"/>
         </w:rPr>
         <w:t xml:space="preserve">The forest’s annual ROC-AUC is 0.8715 in 2023, 0.8777 in 2024 and 0.9329 in 2025. Annual average precision is 2.793%, 2.927% and 2.904%, respectively. Company-cluster 95% intervals for the full later period are 0.8668–0.9061 for ROC-AUC, 1.817%–4.378% for average precision and 0.002040–0.002799 for Brier score. These intervals keep each company’s observations together, but they do not include model-selection uncertainty, shared economic shocks or possible errors in the disclosure labels.</w:t>
+      </w:r>
+    </w:p>
+    <w:p>
+      <w:pPr>
+        <w:pStyle w:val="BodyText"/>
+        <w:spacing w:before="0" w:after="200" w:line="276" w:lineRule="auto"/>
+        <w:jc w:val="both"/>
+      </w:pPr>
+      <w:r>
+        <w:rPr>
+          <w:rFonts w:ascii="Times New Roman" w:hAnsi="Times New Roman" w:eastAsia="Times New Roman"/>
+          <w:b w:val="0"/>
+          <w:sz w:val="24"/>
+        </w:rPr>
+        <w:t xml:space="preserve">Figure 2 summarizes the ranking and probability diagnostics for the 2023–2025 evaluation period.</w:t>
       </w:r>
     </w:p>
     <w:p>
@@ -25411,7 +25941,7 @@
           <w:iCs/>
           <w:sz w:val="24"/>
         </w:rPr>
-        <w:t xml:space="preserve">Figure 2. Ranking and probability diagnostics for 2023–2025. Source: primary model experiment predictions and model report.</w:t>
+        <w:t xml:space="preserve">Figure 2. Model diagnostics, 2023–2025.</w:t>
       </w:r>
     </w:p>
     <w:p>
@@ -25431,7 +25961,7 @@
     </w:p>
     <w:p>
       <w:pPr>
-        <w:pStyle w:val="FirstParagraph"/>
+        <w:pStyle w:val="BodyText"/>
         <w:spacing w:before="0" w:after="200" w:line="276" w:lineRule="auto"/>
         <w:jc w:val="both"/>
       </w:pPr>
@@ -25867,7 +26397,7 @@
     </w:p>
     <w:p>
       <w:pPr>
-        <w:pStyle w:val="FirstParagraph"/>
+        <w:pStyle w:val="BodyText"/>
         <w:spacing w:before="0" w:after="200" w:line="276" w:lineRule="auto"/>
         <w:jc w:val="both"/>
       </w:pPr>
@@ -25928,7 +26458,7 @@
     </w:p>
     <w:p>
       <w:pPr>
-        <w:pStyle w:val="FirstParagraph"/>
+        <w:pStyle w:val="BodyText"/>
         <w:spacing w:before="0" w:after="200" w:line="276" w:lineRule="auto"/>
         <w:jc w:val="both"/>
       </w:pPr>
@@ -25958,7 +26488,7 @@
     </w:p>
     <w:p>
       <w:pPr>
-        <w:pStyle w:val="FirstParagraph"/>
+        <w:pStyle w:val="BodyText"/>
         <w:spacing w:before="0" w:after="200" w:line="276" w:lineRule="auto"/>
         <w:jc w:val="both"/>
       </w:pPr>
@@ -27013,7 +27543,7 @@
     </w:p>
     <w:p>
       <w:pPr>
-        <w:pStyle w:val="FirstParagraph"/>
+        <w:pStyle w:val="BodyText"/>
         <w:spacing w:before="0" w:after="200" w:line="276" w:lineRule="auto"/>
         <w:jc w:val="both"/>
       </w:pPr>
@@ -28017,7 +28547,7 @@
     </w:p>
     <w:p>
       <w:pPr>
-        <w:pStyle w:val="FirstParagraph"/>
+        <w:pStyle w:val="BodyText"/>
         <w:spacing w:before="0" w:after="200" w:line="276" w:lineRule="auto"/>
         <w:jc w:val="both"/>
       </w:pPr>
@@ -29164,6 +29694,21 @@
           <w:sz w:val="24"/>
         </w:rPr>
         <w:t xml:space="preserve">Using probabilities from another fitted model changes the aggregate mean little: random forest gives 0.6678% of assets, XGBoost 0.6658% and either logistic model 0.6669%. Similar averages do not mean that the models assign the same limit to every company.</w:t>
+      </w:r>
+    </w:p>
+    <w:p>
+      <w:pPr>
+        <w:pStyle w:val="BodyText"/>
+        <w:spacing w:before="0" w:after="200" w:line="276" w:lineRule="auto"/>
+        <w:jc w:val="both"/>
+      </w:pPr>
+      <w:r>
+        <w:rPr>
+          <w:rFonts w:ascii="Times New Roman" w:hAnsi="Times New Roman" w:eastAsia="Times New Roman"/>
+          <w:b w:val="0"/>
+          <w:sz w:val="24"/>
+        </w:rPr>
+        <w:t xml:space="preserve">Figure 3 compares the average assigned limit under the reference policy and the alternative assumptions discussed above. Every scenario uses the same historical financial observations.</w:t>
       </w:r>
     </w:p>
     <w:p>
@@ -29229,7 +29774,7 @@
           <w:iCs/>
           <w:sz w:val="24"/>
         </w:rPr>
-        <w:t xml:space="preserve">Figure 3. Average assigned limit as a percentage of reported assets under the reference policy and selected alternative assumptions. Each scenario uses the same historical financial observations. Source: primary model experiment policy replay.</w:t>
+        <w:t xml:space="preserve">Figure 3. Policy sensitivity.</w:t>
       </w:r>
     </w:p>
     <w:p>
@@ -29249,7 +29794,7 @@
     </w:p>
     <w:p>
       <w:pPr>
-        <w:pStyle w:val="FirstParagraph"/>
+        <w:pStyle w:val="BodyText"/>
         <w:spacing w:before="0" w:after="200" w:line="276" w:lineRule="auto"/>
         <w:jc w:val="both"/>
       </w:pPr>
@@ -29688,7 +30233,7 @@
     </w:p>
     <w:p>
       <w:pPr>
-        <w:pStyle w:val="FirstParagraph"/>
+        <w:pStyle w:val="BodyText"/>
         <w:spacing w:before="0" w:after="200" w:line="276" w:lineRule="auto"/>
         <w:jc w:val="both"/>
       </w:pPr>
@@ -29779,7 +30324,7 @@
     </w:p>
     <w:p>
       <w:pPr>
-        <w:pStyle w:val="FirstParagraph"/>
+        <w:pStyle w:val="BodyText"/>
         <w:spacing w:before="0" w:after="200" w:line="276" w:lineRule="auto"/>
         <w:jc w:val="both"/>
       </w:pPr>
@@ -29824,7 +30369,7 @@
     </w:p>
     <w:p>
       <w:pPr>
-        <w:pStyle w:val="FirstParagraph"/>
+        <w:pStyle w:val="BodyText"/>
         <w:spacing w:before="0" w:after="200" w:line="276" w:lineRule="auto"/>
         <w:jc w:val="both"/>
       </w:pPr>
@@ -29869,7 +30414,7 @@
     </w:p>
     <w:p>
       <w:pPr>
-        <w:pStyle w:val="FirstParagraph"/>
+        <w:pStyle w:val="BodyText"/>
         <w:spacing w:before="0" w:after="200" w:line="276" w:lineRule="auto"/>
         <w:jc w:val="both"/>
       </w:pPr>
@@ -29914,7 +30459,7 @@
     </w:p>
     <w:p>
       <w:pPr>
-        <w:pStyle w:val="FirstParagraph"/>
+        <w:pStyle w:val="BodyText"/>
         <w:spacing w:before="0" w:after="200" w:line="276" w:lineRule="auto"/>
         <w:jc w:val="both"/>
       </w:pPr>
@@ -29959,7 +30504,7 @@
     </w:p>
     <w:p>
       <w:pPr>
-        <w:pStyle w:val="FirstParagraph"/>
+        <w:pStyle w:val="BodyText"/>
         <w:spacing w:before="0" w:after="200" w:line="276" w:lineRule="auto"/>
         <w:jc w:val="both"/>
       </w:pPr>
@@ -30019,7 +30564,7 @@
     </w:p>
     <w:p>
       <w:pPr>
-        <w:pStyle w:val="FirstParagraph"/>
+        <w:pStyle w:val="BodyText"/>
         <w:spacing w:before="0" w:after="200" w:line="276" w:lineRule="auto"/>
         <w:jc w:val="both"/>
       </w:pPr>
@@ -30124,7 +30669,7 @@
     </w:p>
     <w:p>
       <w:pPr>
-        <w:pStyle w:val="FirstParagraph"/>
+        <w:pStyle w:val="BodyText"/>
         <w:spacing w:before="0" w:after="200" w:line="276" w:lineRule="auto"/>
         <w:jc w:val="both"/>
       </w:pPr>
@@ -30144,7 +30689,8 @@
           <w:ilvl w:val="0"/>
           <w:numId w:val="1007"/>
         </w:numPr>
-        <w:spacing w:before="0" w:after="200" w:line="276" w:lineRule="auto"/>
+        <w:spacing w:before="0" w:after="40" w:line="276" w:lineRule="auto"/>
+        <w:ind w:left="397" w:hanging="227"/>
         <w:jc w:val="left"/>
       </w:pPr>
       <w:r>
@@ -30180,7 +30726,8 @@
           <w:ilvl w:val="0"/>
           <w:numId w:val="1007"/>
         </w:numPr>
-        <w:spacing w:before="0" w:after="200" w:line="276" w:lineRule="auto"/>
+        <w:spacing w:before="0" w:after="40" w:line="276" w:lineRule="auto"/>
+        <w:ind w:left="397" w:hanging="227"/>
         <w:jc w:val="left"/>
       </w:pPr>
       <w:r>
@@ -30216,7 +30763,8 @@
           <w:ilvl w:val="0"/>
           <w:numId w:val="1007"/>
         </w:numPr>
-        <w:spacing w:before="0" w:after="200" w:line="276" w:lineRule="auto"/>
+        <w:spacing w:before="0" w:after="40" w:line="276" w:lineRule="auto"/>
+        <w:ind w:left="397" w:hanging="227"/>
         <w:jc w:val="left"/>
       </w:pPr>
       <w:r>
@@ -30252,7 +30800,8 @@
           <w:ilvl w:val="0"/>
           <w:numId w:val="1007"/>
         </w:numPr>
-        <w:spacing w:before="0" w:after="200" w:line="276" w:lineRule="auto"/>
+        <w:spacing w:before="0" w:after="40" w:line="276" w:lineRule="auto"/>
+        <w:ind w:left="397" w:hanging="227"/>
         <w:jc w:val="left"/>
       </w:pPr>
       <w:r>
@@ -30283,7 +30832,7 @@
     </w:p>
     <w:p>
       <w:pPr>
-        <w:pStyle w:val="FirstParagraph"/>
+        <w:pStyle w:val="BodyText"/>
         <w:spacing w:before="0" w:after="200" w:line="276" w:lineRule="auto"/>
         <w:jc w:val="both"/>
       </w:pPr>
@@ -30313,7 +30862,7 @@
     </w:p>
     <w:p>
       <w:pPr>
-        <w:pStyle w:val="FirstParagraph"/>
+        <w:pStyle w:val="BodyText"/>
         <w:spacing w:before="0" w:after="200" w:line="276" w:lineRule="auto"/>
         <w:jc w:val="both"/>
       </w:pPr>
@@ -30374,7 +30923,7 @@
     </w:p>
     <w:p>
       <w:pPr>
-        <w:pStyle w:val="FirstParagraph"/>
+        <w:pStyle w:val="BodyText"/>
         <w:spacing w:before="0" w:after="200" w:line="276" w:lineRule="auto"/>
         <w:jc w:val="both"/>
       </w:pPr>
@@ -31323,7 +31872,7 @@
     </w:p>
     <w:p>
       <w:pPr>
-        <w:pStyle w:val="FirstParagraph"/>
+        <w:pStyle w:val="BodyText"/>
         <w:spacing w:before="0" w:after="200" w:line="276" w:lineRule="auto"/>
         <w:jc w:val="both"/>
       </w:pPr>
@@ -31928,7 +32477,7 @@
     </w:p>
     <w:p>
       <w:pPr>
-        <w:pStyle w:val="FirstParagraph"/>
+        <w:pStyle w:val="BodyText"/>
         <w:spacing w:before="0" w:after="200" w:line="276" w:lineRule="auto"/>
         <w:jc w:val="both"/>
       </w:pPr>
@@ -33472,7 +34021,7 @@
     </w:p>
     <w:p>
       <w:pPr>
-        <w:pStyle w:val="FirstParagraph"/>
+        <w:pStyle w:val="BodyText"/>
         <w:spacing w:before="0" w:after="200" w:line="276" w:lineRule="auto"/>
         <w:jc w:val="both"/>
       </w:pPr>

</xml_diff>